<commit_message>
Update May 18 daily note PDF source
</commit_message>
<xml_diff>
--- a/デイリーノート5月18日.docx
+++ b/デイリーノート5月18日.docx
@@ -5,7 +5,7 @@
     <w:p>
       <w:pPr>
         <w:rPr>
-          <w:rFonts w:ascii="游ゴシック Medium" w:eastAsia="游ゴシック Medium" w:hAnsi="游ゴシック Medium" w:hint="eastAsia"/>
+          <w:rFonts w:ascii="游ゴシック Medium" w:eastAsia="游ゴシック Medium" w:hAnsi="游ゴシック Medium"/>
           <w:sz w:val="28"/>
         </w:rPr>
       </w:pPr>
@@ -419,7 +419,7 @@
               </w:numPr>
               <w:ind w:leftChars="0"/>
               <w:rPr>
-                <w:rFonts w:ascii="游ゴシック Medium" w:eastAsia="游ゴシック Medium" w:hAnsi="游ゴシック Medium" w:hint="eastAsia"/>
+                <w:rFonts w:ascii="游ゴシック Medium" w:eastAsia="游ゴシック Medium" w:hAnsi="游ゴシック Medium"/>
                 <w:sz w:val="18"/>
                 <w:szCs w:val="18"/>
               </w:rPr>
@@ -729,7 +729,7 @@
           <w:p>
             <w:pPr>
               <w:rPr>
-                <w:rFonts w:ascii="游ゴシック Medium" w:eastAsia="游ゴシック Medium" w:hAnsi="游ゴシック Medium" w:hint="eastAsia"/>
+                <w:rFonts w:ascii="游ゴシック Medium" w:eastAsia="游ゴシック Medium" w:hAnsi="游ゴシック Medium"/>
               </w:rPr>
             </w:pPr>
             <w:r>
@@ -773,336 +773,357 @@
           <w:p>
             <w:pPr>
               <w:rPr>
-                <w:rFonts w:ascii="游ゴシック Medium" w:eastAsia="游ゴシック Medium" w:hAnsi="游ゴシック Medium"/>
-              </w:rPr>
-            </w:pPr>
-          </w:p>
-          <w:p>
-            <w:pPr>
-              <w:rPr>
-                <w:rFonts w:ascii="游ゴシック Medium" w:eastAsia="游ゴシック Medium" w:hAnsi="游ゴシック Medium" w:hint="eastAsia"/>
-              </w:rPr>
-            </w:pPr>
+                <w:rFonts w:ascii="游ゴシック Medium" w:eastAsia="游ゴシック Medium" w:hAnsi="游ゴシック Medium" w:hint="eastAsia"/>
+              </w:rPr>
+            </w:pPr>
+          </w:p>
+          <w:p>
+            <w:pPr>
+              <w:rPr>
+                <w:rFonts w:ascii="游ゴシック Medium" w:eastAsia="游ゴシック Medium" w:hAnsi="游ゴシック Medium"/>
+              </w:rPr>
+            </w:pPr>
+            <w:r>
+              <w:rPr>
+                <w:rFonts w:ascii="游ゴシック Medium" w:eastAsia="游ゴシック Medium" w:hAnsi="游ゴシック Medium" w:hint="eastAsia"/>
+              </w:rPr>
+              <w:t xml:space="preserve">見学内容　</w:t>
+            </w:r>
+            <w:r>
+              <w:rPr>
+                <w:rFonts w:ascii="游ゴシック Medium" w:eastAsia="游ゴシック Medium" w:hAnsi="游ゴシック Medium" w:hint="eastAsia"/>
+              </w:rPr>
+              <w:t xml:space="preserve">　</w:t>
+            </w:r>
+            <w:r>
+              <w:rPr>
+                <w:rFonts w:ascii="游ゴシック Medium" w:eastAsia="游ゴシック Medium" w:hAnsi="游ゴシック Medium" w:hint="eastAsia"/>
+              </w:rPr>
+              <w:t>ベッドから車椅子への移乗、歩行、立ち上がり</w:t>
+            </w:r>
+          </w:p>
+          <w:p>
+            <w:pPr>
+              <w:rPr>
+                <w:rFonts w:ascii="游ゴシック Medium" w:eastAsia="游ゴシック Medium" w:hAnsi="游ゴシック Medium"/>
+              </w:rPr>
+            </w:pPr>
+          </w:p>
+          <w:p>
+            <w:pPr>
+              <w:rPr>
+                <w:rFonts w:ascii="游ゴシック Medium" w:eastAsia="游ゴシック Medium" w:hAnsi="游ゴシック Medium"/>
+              </w:rPr>
+            </w:pPr>
+            <w:r>
+              <w:rPr>
+                <w:rFonts w:ascii="游ゴシック Medium" w:eastAsia="游ゴシック Medium" w:hAnsi="游ゴシック Medium" w:hint="eastAsia"/>
+              </w:rPr>
+              <w:t>情報収集</w:t>
+            </w:r>
+            <w:r>
+              <w:rPr>
+                <w:rFonts w:ascii="游ゴシック Medium" w:eastAsia="游ゴシック Medium" w:hAnsi="游ゴシック Medium" w:hint="eastAsia"/>
+              </w:rPr>
+              <w:t xml:space="preserve">　</w:t>
+            </w:r>
+            <w:r>
+              <w:rPr>
+                <w:rFonts w:ascii="游ゴシック Medium" w:eastAsia="游ゴシック Medium" w:hAnsi="游ゴシック Medium" w:hint="eastAsia"/>
+              </w:rPr>
+              <w:t xml:space="preserve">　</w:t>
+            </w:r>
+            <w:r>
+              <w:rPr>
+                <w:rFonts w:ascii="游ゴシック Medium" w:eastAsia="游ゴシック Medium" w:hAnsi="游ゴシック Medium" w:hint="eastAsia"/>
+              </w:rPr>
+              <w:t>指示したことに対する理解が苦手。</w:t>
+            </w:r>
+            <w:r>
+              <w:rPr>
+                <w:rFonts w:ascii="游ゴシック Medium" w:eastAsia="游ゴシック Medium" w:hAnsi="游ゴシック Medium" w:hint="eastAsia"/>
+              </w:rPr>
+              <w:t>パーキンソン特有の症状は見られない。</w:t>
+            </w:r>
+          </w:p>
+          <w:p>
+            <w:pPr>
+              <w:rPr>
+                <w:rFonts w:ascii="游ゴシック Medium" w:eastAsia="游ゴシック Medium" w:hAnsi="游ゴシック Medium" w:hint="eastAsia"/>
+              </w:rPr>
+            </w:pPr>
+          </w:p>
+          <w:p>
+            <w:pPr>
+              <w:rPr>
+                <w:rFonts w:ascii="游ゴシック Medium" w:eastAsia="游ゴシック Medium" w:hAnsi="游ゴシック Medium"/>
+              </w:rPr>
+            </w:pPr>
+            <w:r>
+              <w:rPr>
+                <w:rFonts w:ascii="游ゴシック Medium" w:eastAsia="游ゴシック Medium" w:hAnsi="游ゴシック Medium" w:hint="eastAsia"/>
+              </w:rPr>
+              <w:t>動作観察</w:t>
+            </w:r>
+            <w:r>
+              <w:rPr>
+                <w:rFonts w:ascii="游ゴシック Medium" w:eastAsia="游ゴシック Medium" w:hAnsi="游ゴシック Medium" w:hint="eastAsia"/>
+              </w:rPr>
+              <w:t xml:space="preserve">　</w:t>
+            </w:r>
+          </w:p>
+          <w:p>
+            <w:pPr>
+              <w:rPr>
+                <w:rFonts w:ascii="游ゴシック Medium" w:eastAsia="游ゴシック Medium" w:hAnsi="游ゴシック Medium"/>
+              </w:rPr>
+            </w:pPr>
+            <w:r>
+              <w:rPr>
+                <w:rFonts w:ascii="游ゴシック Medium" w:eastAsia="游ゴシック Medium" w:hAnsi="游ゴシック Medium" w:hint="eastAsia"/>
+              </w:rPr>
+              <w:t>歩行分析（歩行周期全般での頸部屈曲位、体幹屈曲位、膝関節屈曲位、</w:t>
+            </w:r>
+            <w:r>
+              <w:rPr>
+                <w:rFonts w:ascii="游ゴシック Medium" w:eastAsia="游ゴシック Medium" w:hAnsi="游ゴシック Medium" w:hint="eastAsia"/>
+              </w:rPr>
+              <w:t>右足の遊脚終期の内</w:t>
+            </w:r>
+            <w:r>
+              <w:rPr>
+                <w:rFonts w:ascii="Apple Color Emoji" w:eastAsia="游ゴシック Medium" w:hAnsi="Apple Color Emoji" w:cs="Apple Color Emoji" w:hint="eastAsia"/>
+              </w:rPr>
+              <w:t>反尖足、右上肢</w:t>
+            </w:r>
+            <w:r>
+              <w:rPr>
+                <w:rFonts w:ascii="Cambria" w:eastAsia="游ゴシック Medium" w:hAnsi="Cambria" w:cs="Cambria" w:hint="eastAsia"/>
+              </w:rPr>
+              <w:t>のマン・ウェルニッケ肢位</w:t>
+            </w:r>
+            <w:r>
+              <w:rPr>
+                <w:rFonts w:ascii="Apple Color Emoji" w:eastAsia="游ゴシック Medium" w:hAnsi="Apple Color Emoji" w:cs="Apple Color Emoji" w:hint="eastAsia"/>
+              </w:rPr>
+              <w:t>）</w:t>
+            </w:r>
+          </w:p>
+          <w:p>
+            <w:pPr>
+              <w:rPr>
+                <w:rFonts w:ascii="游ゴシック Medium" w:eastAsia="游ゴシック Medium" w:hAnsi="游ゴシック Medium"/>
+              </w:rPr>
+            </w:pPr>
+          </w:p>
+          <w:p>
+            <w:pPr>
+              <w:rPr>
+                <w:rFonts w:ascii="游ゴシック Medium" w:eastAsia="游ゴシック Medium" w:hAnsi="游ゴシック Medium"/>
+              </w:rPr>
+            </w:pPr>
+            <w:r>
+              <w:rPr>
+                <w:rFonts w:ascii="游ゴシック Medium" w:eastAsia="游ゴシック Medium" w:hAnsi="游ゴシック Medium" w:hint="eastAsia"/>
+              </w:rPr>
+              <w:t xml:space="preserve">統合と解釈　</w:t>
+            </w:r>
+            <w:r>
+              <w:rPr>
+                <w:rFonts w:ascii="游ゴシック Medium" w:eastAsia="游ゴシック Medium" w:hAnsi="游ゴシック Medium" w:hint="eastAsia"/>
+              </w:rPr>
+              <w:t xml:space="preserve">　</w:t>
+            </w:r>
+          </w:p>
+          <w:p>
+            <w:pPr>
+              <w:rPr>
+                <w:rFonts w:ascii="游ゴシック Medium" w:eastAsia="游ゴシック Medium" w:hAnsi="游ゴシック Medium"/>
+              </w:rPr>
+            </w:pPr>
+            <w:r>
+              <w:rPr>
+                <w:rFonts w:ascii="游ゴシック Medium" w:eastAsia="游ゴシック Medium" w:hAnsi="游ゴシック Medium" w:hint="eastAsia"/>
+              </w:rPr>
+              <w:t>A様は脳幹梗塞による右片麻痺があり、歩行では頸部・体幹・膝関節が屈曲位となり、右遊脚終期に内反尖足がみられた。そのため右下肢の接地が不安定になり、移乗や歩行時の安全性に影響していると考えた。また右上</w:t>
+            </w:r>
+            <w:r>
+              <w:rPr>
+                <w:rFonts w:ascii="游ゴシック Medium" w:eastAsia="游ゴシック Medium" w:hAnsi="游ゴシック Medium" w:hint="eastAsia"/>
+              </w:rPr>
+              <w:t>下</w:t>
+            </w:r>
+            <w:r>
+              <w:rPr>
+                <w:rFonts w:ascii="游ゴシック Medium" w:eastAsia="游ゴシック Medium" w:hAnsi="游ゴシック Medium" w:hint="eastAsia"/>
+              </w:rPr>
+              <w:t>肢はマン・ウェルニッケ肢位がみられ、麻痺側上肢の随意性低下も考えられる。指示理解が苦手な面があるため、動作練習では短く分かりやすい声かけが必要である</w:t>
+            </w:r>
+            <w:r>
+              <w:rPr>
+                <w:rFonts w:ascii="游ゴシック Medium" w:eastAsia="游ゴシック Medium" w:hAnsi="游ゴシック Medium" w:hint="eastAsia"/>
+              </w:rPr>
+              <w:t>と考えた</w:t>
+            </w:r>
+            <w:r>
+              <w:rPr>
+                <w:rFonts w:ascii="游ゴシック Medium" w:eastAsia="游ゴシック Medium" w:hAnsi="游ゴシック Medium" w:hint="eastAsia"/>
+              </w:rPr>
+              <w:t>。</w:t>
+            </w:r>
+          </w:p>
+          <w:p>
+            <w:pPr>
+              <w:rPr>
+                <w:rFonts w:ascii="游ゴシック Medium" w:eastAsia="游ゴシック Medium" w:hAnsi="游ゴシック Medium" w:hint="eastAsia"/>
+              </w:rPr>
+            </w:pPr>
+          </w:p>
+          <w:p>
+            <w:pPr>
+              <w:rPr>
+                <w:rFonts w:ascii="游ゴシック Medium" w:eastAsia="游ゴシック Medium" w:hAnsi="游ゴシック Medium"/>
+              </w:rPr>
+            </w:pPr>
+            <w:r>
+              <w:rPr>
+                <w:rFonts w:ascii="游ゴシック Medium" w:eastAsia="游ゴシック Medium" w:hAnsi="游ゴシック Medium" w:hint="eastAsia"/>
+              </w:rPr>
+              <w:t xml:space="preserve">問題点の抽出　</w:t>
+            </w:r>
+          </w:p>
+          <w:p>
+            <w:pPr>
+              <w:rPr>
+                <w:rFonts w:ascii="游ゴシック Medium" w:eastAsia="游ゴシック Medium" w:hAnsi="游ゴシック Medium"/>
+              </w:rPr>
+            </w:pPr>
+            <w:r>
+              <w:rPr>
+                <w:rFonts w:ascii="游ゴシック Medium" w:eastAsia="游ゴシック Medium" w:hAnsi="游ゴシック Medium" w:hint="eastAsia"/>
+              </w:rPr>
+              <w:t>右片麻痺による右下肢の振り出しの不安定さ、右足部の内反尖足、頸部・体幹・膝関節屈曲位での歩行姿勢、右上</w:t>
+            </w:r>
+            <w:r>
+              <w:rPr>
+                <w:rFonts w:ascii="游ゴシック Medium" w:eastAsia="游ゴシック Medium" w:hAnsi="游ゴシック Medium" w:hint="eastAsia"/>
+              </w:rPr>
+              <w:t>下</w:t>
+            </w:r>
+            <w:r>
+              <w:rPr>
+                <w:rFonts w:ascii="游ゴシック Medium" w:eastAsia="游ゴシック Medium" w:hAnsi="游ゴシック Medium" w:hint="eastAsia"/>
+              </w:rPr>
+              <w:t>肢のマン・ウェルニッケ肢位、指示理解のしにくさ</w:t>
+            </w:r>
           </w:p>
           <w:p>
             <w:pPr>
               <w:pStyle w:val="a8"/>
-              <w:numPr>
-                <w:ilvl w:val="0"/>
-                <w:numId w:val="12"/>
-              </w:numPr>
-              <w:ind w:leftChars="0"/>
-              <w:rPr>
-                <w:rFonts w:ascii="游ゴシック Medium" w:eastAsia="游ゴシック Medium" w:hAnsi="游ゴシック Medium" w:hint="eastAsia"/>
-              </w:rPr>
-            </w:pPr>
-            <w:r>
-              <w:rPr>
-                <w:rFonts w:ascii="游ゴシック Medium" w:eastAsia="游ゴシック Medium" w:hAnsi="游ゴシック Medium" w:hint="eastAsia"/>
-              </w:rPr>
-              <w:t xml:space="preserve">　見学内容　</w:t>
-            </w:r>
-            <w:r>
-              <w:rPr>
-                <w:rFonts w:ascii="游ゴシック Medium" w:eastAsia="游ゴシック Medium" w:hAnsi="游ゴシック Medium" w:hint="eastAsia"/>
-              </w:rPr>
-              <w:t>ベッドから車椅子への移乗、歩行、立ち上がり</w:t>
+              <w:ind w:leftChars="0" w:left="360"/>
+              <w:rPr>
+                <w:rFonts w:ascii="游ゴシック Medium" w:eastAsia="游ゴシック Medium" w:hAnsi="游ゴシック Medium"/>
+              </w:rPr>
+            </w:pPr>
+          </w:p>
+          <w:p>
+            <w:pPr>
+              <w:rPr>
+                <w:rFonts w:ascii="游ゴシック Medium" w:eastAsia="游ゴシック Medium" w:hAnsi="游ゴシック Medium"/>
+              </w:rPr>
+            </w:pPr>
+            <w:r>
+              <w:rPr>
+                <w:rFonts w:ascii="游ゴシック Medium" w:eastAsia="游ゴシック Medium" w:hAnsi="游ゴシック Medium" w:hint="eastAsia"/>
+              </w:rPr>
+              <w:t xml:space="preserve">目標設定　</w:t>
+            </w:r>
+          </w:p>
+          <w:p>
+            <w:pPr>
+              <w:rPr>
+                <w:rFonts w:ascii="游ゴシック Medium" w:eastAsia="游ゴシック Medium" w:hAnsi="游ゴシック Medium" w:hint="eastAsia"/>
+              </w:rPr>
+            </w:pPr>
+            <w:r>
+              <w:rPr>
+                <w:rFonts w:ascii="游ゴシック Medium" w:eastAsia="游ゴシック Medium" w:hAnsi="游ゴシック Medium" w:hint="eastAsia"/>
+              </w:rPr>
+              <w:t>右下肢の振り出しと立位姿勢を整え</w:t>
+            </w:r>
+            <w:r>
+              <w:rPr>
+                <w:rFonts w:ascii="游ゴシック Medium" w:eastAsia="游ゴシック Medium" w:hAnsi="游ゴシック Medium" w:hint="eastAsia"/>
+              </w:rPr>
+              <w:t>る。</w:t>
+            </w:r>
+            <w:r>
+              <w:rPr>
+                <w:rFonts w:ascii="游ゴシック Medium" w:eastAsia="游ゴシック Medium" w:hAnsi="游ゴシック Medium" w:hint="eastAsia"/>
+              </w:rPr>
+              <w:t>内反尖足</w:t>
+            </w:r>
+            <w:r>
+              <w:rPr>
+                <w:rFonts w:ascii="游ゴシック Medium" w:eastAsia="游ゴシック Medium" w:hAnsi="游ゴシック Medium" w:hint="eastAsia"/>
+              </w:rPr>
+              <w:t>を抑える。</w:t>
             </w:r>
           </w:p>
           <w:p>
             <w:pPr>
               <w:pStyle w:val="a8"/>
-              <w:numPr>
-                <w:ilvl w:val="0"/>
-                <w:numId w:val="12"/>
-              </w:numPr>
-              <w:ind w:leftChars="0"/>
-              <w:rPr>
-                <w:rFonts w:ascii="游ゴシック Medium" w:eastAsia="游ゴシック Medium" w:hAnsi="游ゴシック Medium"/>
-              </w:rPr>
-            </w:pPr>
-            <w:r>
-              <w:rPr>
-                <w:rFonts w:ascii="游ゴシック Medium" w:eastAsia="游ゴシック Medium" w:hAnsi="游ゴシック Medium" w:hint="eastAsia"/>
-              </w:rPr>
-              <w:t xml:space="preserve">　情報収集</w:t>
-            </w:r>
-            <w:r>
-              <w:rPr>
-                <w:rFonts w:ascii="游ゴシック Medium" w:eastAsia="游ゴシック Medium" w:hAnsi="游ゴシック Medium" w:hint="eastAsia"/>
-              </w:rPr>
-              <w:t xml:space="preserve">　指示したことに対する理解が苦手。</w:t>
-            </w:r>
-            <w:r>
-              <w:rPr>
-                <w:rFonts w:ascii="游ゴシック Medium" w:eastAsia="游ゴシック Medium" w:hAnsi="游ゴシック Medium" w:hint="eastAsia"/>
-              </w:rPr>
-              <w:t>パーキンソン特有の症状は見られない。</w:t>
-            </w:r>
-          </w:p>
-          <w:p>
-            <w:pPr>
-              <w:pStyle w:val="a8"/>
-              <w:numPr>
-                <w:ilvl w:val="0"/>
-                <w:numId w:val="12"/>
-              </w:numPr>
-              <w:ind w:leftChars="0"/>
-              <w:rPr>
-                <w:rFonts w:ascii="游ゴシック Medium" w:eastAsia="游ゴシック Medium" w:hAnsi="游ゴシック Medium"/>
-              </w:rPr>
-            </w:pPr>
-            <w:r>
-              <w:rPr>
-                <w:rFonts w:ascii="游ゴシック Medium" w:eastAsia="游ゴシック Medium" w:hAnsi="游ゴシック Medium" w:hint="eastAsia"/>
-              </w:rPr>
-              <w:t xml:space="preserve">　検査測定</w:t>
-            </w:r>
-            <w:r>
-              <w:rPr>
-                <w:rFonts w:ascii="游ゴシック Medium" w:eastAsia="游ゴシック Medium" w:hAnsi="游ゴシック Medium" w:hint="eastAsia"/>
-              </w:rPr>
-              <w:t xml:space="preserve">　特になし</w:t>
-            </w:r>
-          </w:p>
-          <w:p>
-            <w:pPr>
-              <w:pStyle w:val="a8"/>
-              <w:numPr>
-                <w:ilvl w:val="0"/>
-                <w:numId w:val="12"/>
-              </w:numPr>
-              <w:ind w:leftChars="0"/>
-              <w:rPr>
-                <w:rFonts w:ascii="游ゴシック Medium" w:eastAsia="游ゴシック Medium" w:hAnsi="游ゴシック Medium" w:hint="eastAsia"/>
-              </w:rPr>
-            </w:pPr>
-            <w:r>
-              <w:rPr>
-                <w:rFonts w:ascii="游ゴシック Medium" w:eastAsia="游ゴシック Medium" w:hAnsi="游ゴシック Medium" w:hint="eastAsia"/>
-              </w:rPr>
-              <w:t xml:space="preserve">　動作観察</w:t>
-            </w:r>
-            <w:r>
-              <w:rPr>
-                <w:rFonts w:ascii="游ゴシック Medium" w:eastAsia="游ゴシック Medium" w:hAnsi="游ゴシック Medium" w:hint="eastAsia"/>
-              </w:rPr>
-              <w:t xml:space="preserve">　歩行分析（歩行周期全般での頸部屈曲位、体幹屈曲位、膝関節屈曲位、</w:t>
-            </w:r>
-            <w:r>
-              <w:rPr>
-                <w:rFonts w:ascii="游ゴシック Medium" w:eastAsia="游ゴシック Medium" w:hAnsi="游ゴシック Medium" w:hint="eastAsia"/>
-              </w:rPr>
-              <w:t>右足の遊脚終期の内</w:t>
-            </w:r>
-            <w:r>
-              <w:rPr>
-                <w:rFonts w:ascii="Apple Color Emoji" w:eastAsia="游ゴシック Medium" w:hAnsi="Apple Color Emoji" w:cs="Apple Color Emoji" w:hint="eastAsia"/>
-              </w:rPr>
-              <w:t>反尖足、右上肢</w:t>
-            </w:r>
-            <w:r>
-              <w:rPr>
-                <w:rFonts w:ascii="Cambria" w:eastAsia="游ゴシック Medium" w:hAnsi="Cambria" w:cs="Cambria" w:hint="eastAsia"/>
-              </w:rPr>
-              <w:t>のマン・ウェルニッケ肢位</w:t>
-            </w:r>
-            <w:r>
-              <w:rPr>
-                <w:rFonts w:ascii="Apple Color Emoji" w:eastAsia="游ゴシック Medium" w:hAnsi="Apple Color Emoji" w:cs="Apple Color Emoji" w:hint="eastAsia"/>
-              </w:rPr>
-              <w:t>）</w:t>
-            </w:r>
-          </w:p>
-          <w:p>
-            <w:pPr>
-              <w:pStyle w:val="a8"/>
-              <w:numPr>
-                <w:ilvl w:val="0"/>
-                <w:numId w:val="12"/>
-              </w:numPr>
-              <w:ind w:leftChars="0"/>
-              <w:rPr>
-                <w:rFonts w:ascii="游ゴシック Medium" w:eastAsia="游ゴシック Medium" w:hAnsi="游ゴシック Medium"/>
-              </w:rPr>
-            </w:pPr>
-            <w:r>
-              <w:rPr>
-                <w:rFonts w:ascii="游ゴシック Medium" w:eastAsia="游ゴシック Medium" w:hAnsi="游ゴシック Medium" w:hint="eastAsia"/>
-              </w:rPr>
-              <w:t xml:space="preserve">　統合と解釈　A様は脳幹梗塞による右片麻痺があり、歩行では頸部・体幹・膝関節が屈曲位となり、右遊脚終期に内反尖足がみられた。そのため右下肢の振り出しや接地が不安定になり、移乗や歩行時の安全性に影響していると考えた。また右上肢はマン・ウェルニッケ肢位がみられ、麻痺側上肢の随意性低下も考えられる。指示理解が苦手な面があるため、動作練習では短く分かりやすい声かけが必要である。一方で、パーキンソン病特有の症状は目立たず、立ち上がりや歩行の練習場面を確認できた点は残存機能として捉えられる。</w:t>
-            </w:r>
-            <w:r>
-              <w:rPr>
-                <w:rFonts w:ascii="游ゴシック Medium" w:eastAsia="游ゴシック Medium" w:hAnsi="游ゴシック Medium" w:hint="eastAsia"/>
-              </w:rPr>
-            </w:r>
-          </w:p>
-          <w:p>
-            <w:pPr>
-              <w:pStyle w:val="a8"/>
-              <w:numPr>
-                <w:ilvl w:val="0"/>
-                <w:numId w:val="12"/>
-              </w:numPr>
-              <w:ind w:leftChars="0"/>
-              <w:rPr>
-                <w:rFonts w:ascii="游ゴシック Medium" w:eastAsia="游ゴシック Medium" w:hAnsi="游ゴシック Medium"/>
-              </w:rPr>
-            </w:pPr>
-            <w:r>
-              <w:rPr>
-                <w:rFonts w:ascii="游ゴシック Medium" w:eastAsia="游ゴシック Medium" w:hAnsi="游ゴシック Medium" w:hint="eastAsia"/>
-              </w:rPr>
-              <w:t xml:space="preserve">　問題点の抽出　右片麻痺による右下肢の振り出しの不安定さ、右足部の内反尖足、頸部・体幹・膝関節屈曲位での歩行姿勢、右上肢のマン・ウェルニッケ肢位、指示理解のしにくさによる動作時の安全性低下が問題点として考えられる。</w:t>
-            </w:r>
-          </w:p>
-          <w:p>
-            <w:pPr>
-              <w:pStyle w:val="a8"/>
-              <w:numPr>
-                <w:ilvl w:val="0"/>
-                <w:numId w:val="12"/>
-              </w:numPr>
-              <w:ind w:leftChars="0"/>
-              <w:rPr>
-                <w:rFonts w:ascii="游ゴシック Medium" w:eastAsia="游ゴシック Medium" w:hAnsi="游ゴシック Medium"/>
-              </w:rPr>
-            </w:pPr>
-            <w:r>
-              <w:rPr>
-                <w:rFonts w:ascii="游ゴシック Medium" w:eastAsia="游ゴシック Medium" w:hAnsi="游ゴシック Medium" w:hint="eastAsia"/>
-              </w:rPr>
-              <w:t xml:space="preserve">　目標設定　短期目標は、簡単な声かけを理解しながら、介助下で安全に立ち上がりと車椅子移乗を行えることである。長期目標は、右下肢の振り出しと立位姿勢を整え、必要な介助のもとで病棟内移動につながる歩行練習を安全に行えることである。</w:t>
-            </w:r>
-          </w:p>
-          <w:p>
-            <w:pPr>
-              <w:pStyle w:val="a8"/>
-              <w:numPr>
-                <w:ilvl w:val="0"/>
-                <w:numId w:val="12"/>
-              </w:numPr>
-              <w:ind w:leftChars="0"/>
-              <w:rPr>
-                <w:rFonts w:ascii="游ゴシック Medium" w:eastAsia="游ゴシック Medium" w:hAnsi="游ゴシック Medium"/>
-              </w:rPr>
-            </w:pPr>
-            <w:r>
-              <w:rPr>
-                <w:rFonts w:ascii="游ゴシック Medium" w:eastAsia="游ゴシック Medium" w:hAnsi="游ゴシック Medium" w:hint="eastAsia"/>
-              </w:rPr>
-              <w:t xml:space="preserve">　プログラム立案　右下肢の振り出しと立位安定性を高めるため、座位での前方ステップ練習から開始し、可能であれば立位でのステップ練習や足踏みに進める。立ち上がりでは体幹前傾と足部位置を確認し、歩行練習へ進めるかを評価する。声かけは短く具体的にし、理解しやすい環境で行う。</w:t>
-            </w:r>
-            <w:r>
-              <w:rPr>
-                <w:rFonts w:ascii="游ゴシック Medium" w:eastAsia="游ゴシック Medium" w:hAnsi="游ゴシック Medium"/>
-              </w:rPr>
-            </w:r>
-          </w:p>
-          <w:p>
-            <w:pPr>
-              <w:pStyle w:val="a8"/>
-              <w:numPr>
-                <w:ilvl w:val="0"/>
-                <w:numId w:val="12"/>
-              </w:numPr>
-              <w:ind w:leftChars="0"/>
-              <w:rPr>
-                <w:rFonts w:ascii="游ゴシック Medium" w:eastAsia="游ゴシック Medium" w:hAnsi="游ゴシック Medium"/>
-              </w:rPr>
-            </w:pPr>
-            <w:r>
-              <w:rPr>
-                <w:rFonts w:ascii="游ゴシック Medium" w:eastAsia="游ゴシック Medium" w:hAnsi="游ゴシック Medium" w:hint="eastAsia"/>
-              </w:rPr>
-              <w:t xml:space="preserve">　プログラム実施　本日は見学が中心であり、自分で直接プログラムを実施する場面は少なかった。指導では、座位で足を前方へ出す練習を行い、立位練習へ進めてよいか確認すること、さらに立位でのステップ練習や足踏みを通して歩行練習の可否を判断することを学んだ。</w:t>
-            </w:r>
-            <w:r>
-              <w:rPr>
-                <w:rFonts w:ascii="游ゴシック Medium" w:eastAsia="游ゴシック Medium" w:hAnsi="游ゴシック Medium"/>
-              </w:rPr>
-            </w:r>
-          </w:p>
-          <w:p>
-            <w:pPr>
-              <w:pStyle w:val="a8"/>
-              <w:numPr>
-                <w:ilvl w:val="0"/>
-                <w:numId w:val="12"/>
-              </w:numPr>
-              <w:ind w:leftChars="0"/>
-              <w:rPr>
-                <w:rFonts w:ascii="游ゴシック Medium" w:eastAsia="游ゴシック Medium" w:hAnsi="游ゴシック Medium"/>
-              </w:rPr>
-            </w:pPr>
-            <w:r>
-              <w:rPr>
-                <w:rFonts w:ascii="游ゴシック Medium" w:eastAsia="游ゴシック Medium" w:hAnsi="游ゴシック Medium" w:hint="eastAsia"/>
-              </w:rPr>
-              <w:t xml:space="preserve">　再評価　本日は具体的な再評価までは行えていない。今後は座位ステップ、立位ステップ、足踏みの実施前後で、右足部の内反尖足、体幹・膝関節の屈曲姿勢、ふらつき、指示理解の様子を比較し、歩行練習を継続または修正するか判断したい。</w:t>
-            </w:r>
-            <w:r>
-              <w:rPr>
-                <w:rFonts w:ascii="游ゴシック Medium" w:eastAsia="游ゴシック Medium" w:hAnsi="游ゴシック Medium"/>
-              </w:rPr>
-            </w:r>
-          </w:p>
-          <w:p>
-            <w:pPr>
-              <w:rPr>
-                <w:rFonts w:ascii="游ゴシック Medium" w:eastAsia="游ゴシック Medium" w:hAnsi="游ゴシック Medium"/>
-              </w:rPr>
-            </w:pPr>
-          </w:p>
-          <w:p>
-            <w:pPr>
-              <w:rPr>
-                <w:rFonts w:ascii="游ゴシック Medium" w:eastAsia="游ゴシック Medium" w:hAnsi="游ゴシック Medium"/>
-              </w:rPr>
-            </w:pPr>
-          </w:p>
-          <w:p>
-            <w:pPr>
-              <w:rPr>
-                <w:rFonts w:ascii="游ゴシック Medium" w:eastAsia="游ゴシック Medium" w:hAnsi="游ゴシック Medium"/>
-              </w:rPr>
-            </w:pPr>
-          </w:p>
-          <w:p>
-            <w:pPr>
-              <w:rPr>
-                <w:rFonts w:ascii="游ゴシック Medium" w:eastAsia="游ゴシック Medium" w:hAnsi="游ゴシック Medium"/>
-              </w:rPr>
-            </w:pPr>
-          </w:p>
-          <w:p>
-            <w:pPr>
-              <w:rPr>
-                <w:rFonts w:ascii="游ゴシック Medium" w:eastAsia="游ゴシック Medium" w:hAnsi="游ゴシック Medium"/>
-              </w:rPr>
-            </w:pPr>
-          </w:p>
-          <w:p>
-            <w:pPr>
-              <w:rPr>
-                <w:rFonts w:ascii="游ゴシック Medium" w:eastAsia="游ゴシック Medium" w:hAnsi="游ゴシック Medium"/>
-              </w:rPr>
-            </w:pPr>
-          </w:p>
-          <w:p>
-            <w:pPr>
-              <w:rPr>
-                <w:rFonts w:ascii="游ゴシック Medium" w:eastAsia="游ゴシック Medium" w:hAnsi="游ゴシック Medium"/>
-              </w:rPr>
-            </w:pPr>
-          </w:p>
-          <w:p>
-            <w:pPr>
-              <w:rPr>
-                <w:rFonts w:ascii="游ゴシック Medium" w:eastAsia="游ゴシック Medium" w:hAnsi="游ゴシック Medium"/>
-              </w:rPr>
-            </w:pPr>
+              <w:ind w:leftChars="0" w:left="360"/>
+              <w:rPr>
+                <w:rFonts w:ascii="游ゴシック Medium" w:eastAsia="游ゴシック Medium" w:hAnsi="游ゴシック Medium"/>
+              </w:rPr>
+            </w:pPr>
+          </w:p>
+          <w:p>
+            <w:pPr>
+              <w:rPr>
+                <w:rFonts w:ascii="游ゴシック Medium" w:eastAsia="游ゴシック Medium" w:hAnsi="游ゴシック Medium"/>
+              </w:rPr>
+            </w:pPr>
+            <w:r>
+              <w:rPr>
+                <w:rFonts w:ascii="游ゴシック Medium" w:eastAsia="游ゴシック Medium" w:hAnsi="游ゴシック Medium" w:hint="eastAsia"/>
+              </w:rPr>
+              <w:t xml:space="preserve">プログラム立案　</w:t>
+            </w:r>
+          </w:p>
+          <w:p>
+            <w:pPr>
+              <w:rPr>
+                <w:rFonts w:ascii="游ゴシック Medium" w:eastAsia="游ゴシック Medium" w:hAnsi="游ゴシック Medium" w:hint="eastAsia"/>
+              </w:rPr>
+            </w:pPr>
+            <w:r>
+              <w:rPr>
+                <w:rFonts w:ascii="游ゴシック Medium" w:eastAsia="游ゴシック Medium" w:hAnsi="游ゴシック Medium" w:hint="eastAsia"/>
+              </w:rPr>
+              <w:t>足関節背屈</w:t>
+            </w:r>
+            <w:proofErr w:type="spellStart"/>
+            <w:r>
+              <w:rPr>
+                <w:rFonts w:ascii="游ゴシック Medium" w:eastAsia="游ゴシック Medium" w:hAnsi="游ゴシック Medium"/>
+              </w:rPr>
+              <w:t>ROMex</w:t>
+            </w:r>
+            <w:proofErr w:type="spellEnd"/>
+            <w:r>
+              <w:rPr>
+                <w:rFonts w:ascii="游ゴシック Medium" w:eastAsia="游ゴシック Medium" w:hAnsi="游ゴシック Medium" w:hint="eastAsia"/>
+              </w:rPr>
+              <w:t>、両下肢の</w:t>
+            </w:r>
+            <w:r>
+              <w:rPr>
+                <w:rFonts w:ascii="游ゴシック Medium" w:eastAsia="游ゴシック Medium" w:hAnsi="游ゴシック Medium"/>
+              </w:rPr>
+              <w:t>前方ステップ練習</w:t>
+            </w:r>
           </w:p>
           <w:p>
             <w:pPr>
@@ -1175,13 +1196,6 @@
               <w:t>座位で足を前方へステップ練習させて、立位として良いかを評価する。立位でのステップ練習と足踏みを行い、歩行の練習かできそうか評価する</w:t>
             </w:r>
           </w:p>
-          <w:p>
-            <w:pPr>
-              <w:rPr>
-                <w:rFonts w:ascii="游ゴシック Medium" w:eastAsia="游ゴシック Medium" w:hAnsi="游ゴシック Medium"/>
-              </w:rPr>
-            </w:pPr>
-          </w:p>
         </w:tc>
       </w:tr>
       <w:tr>
@@ -1245,20 +1259,6 @@
               </w:rPr>
               <w:t>ミトンとは</w:t>
             </w:r>
-          </w:p>
-          <w:p>
-            <w:pPr>
-              <w:rPr>
-                <w:rFonts w:ascii="游ゴシック Medium" w:eastAsia="游ゴシック Medium" w:hAnsi="游ゴシック Medium"/>
-              </w:rPr>
-            </w:pPr>
-          </w:p>
-          <w:p>
-            <w:pPr>
-              <w:rPr>
-                <w:rFonts w:ascii="游ゴシック Medium" w:eastAsia="游ゴシック Medium" w:hAnsi="游ゴシック Medium"/>
-              </w:rPr>
-            </w:pPr>
           </w:p>
         </w:tc>
       </w:tr>
@@ -1315,7 +1315,7 @@
           <w:p>
             <w:pPr>
               <w:rPr>
-                <w:rFonts w:ascii="游ゴシック Medium" w:eastAsia="游ゴシック Medium" w:hAnsi="游ゴシック Medium" w:hint="eastAsia"/>
+                <w:rFonts w:ascii="游ゴシック Medium" w:eastAsia="游ゴシック Medium" w:hAnsi="游ゴシック Medium"/>
               </w:rPr>
             </w:pPr>
             <w:r>
@@ -1338,7 +1338,7 @@
       <w:pPr>
         <w:ind w:right="824" w:firstLineChars="100" w:firstLine="210"/>
         <w:rPr>
-          <w:rFonts w:ascii="游ゴシック Medium" w:eastAsia="游ゴシック Medium" w:hAnsi="游ゴシック Medium"/>
+          <w:rFonts w:ascii="游ゴシック Medium" w:eastAsia="游ゴシック Medium" w:hAnsi="游ゴシック Medium" w:hint="eastAsia"/>
           <w:bCs/>
         </w:rPr>
       </w:pPr>
@@ -1349,15 +1349,6 @@
         </w:rPr>
         <w:t>※個人情報の取扱いには十分注意すること</w:t>
       </w:r>
-    </w:p>
-    <w:p>
-      <w:pPr>
-        <w:ind w:right="824" w:firstLineChars="100" w:firstLine="210"/>
-        <w:rPr>
-          <w:rFonts w:ascii="游ゴシック Medium" w:eastAsia="游ゴシック Medium" w:hAnsi="游ゴシック Medium" w:hint="eastAsia"/>
-          <w:bCs/>
-        </w:rPr>
-      </w:pPr>
     </w:p>
     <w:sectPr>
       <w:pgSz w:w="11906" w:h="16838"/>

</xml_diff>